<commit_message>
Implement auth rollback, logout-home UX, docs/manual updates, and test tooling
</commit_message>
<xml_diff>
--- a/documentation/QA_Audit_Platform_User_Manual.docx
+++ b/documentation/QA_Audit_Platform_User_Manual.docx
@@ -3,1887 +3,692 @@
 <w:document xmlns:wpc="http://schemas.microsoft.com/office/word/2010/wordprocessingCanvas" xmlns:mo="http://schemas.microsoft.com/office/mac/office/2008/main" xmlns:mc="http://schemas.openxmlformats.org/markup-compatibility/2006" xmlns:mv="urn:schemas-microsoft-com:mac:vml" xmlns:o="urn:schemas-microsoft-com:office:office" xmlns:r="http://schemas.openxmlformats.org/officeDocument/2006/relationships" xmlns:m="http://schemas.openxmlformats.org/officeDocument/2006/math" xmlns:v="urn:schemas-microsoft-com:vml" xmlns:wp14="http://schemas.microsoft.com/office/word/2010/wordprocessingDrawing" xmlns:wp="http://schemas.openxmlformats.org/drawingml/2006/wordprocessingDrawing" xmlns:w10="urn:schemas-microsoft-com:office:word" xmlns:w="http://schemas.openxmlformats.org/wordprocessingml/2006/main" xmlns:w14="http://schemas.microsoft.com/office/word/2010/wordml" xmlns:wpg="http://schemas.microsoft.com/office/word/2010/wordprocessingGroup" xmlns:wpi="http://schemas.microsoft.com/office/word/2010/wordprocessingInk" xmlns:wne="http://schemas.microsoft.com/office/word/2006/wordml" xmlns:wps="http://schemas.microsoft.com/office/word/2010/wordprocessingShape" mc:Ignorable="w14 wp14">
   <w:body>
     <w:p>
+      <w:pPr>
+        <w:pStyle w:val="Heading1"/>
+      </w:pPr>
       <w:r>
-        <w:rPr>
-          <w:b/>
-          <w:color w:val="51594F"/>
-          <w:sz w:val="18"/>
-        </w:rPr>
-        <w:t>INTERNAL HANDBOOK</w:t>
+        <w:t>QA Audit Platform User Manual</w:t>
       </w:r>
     </w:p>
     <w:p>
       <w:pPr>
-        <w:pStyle w:val="Title"/>
+        <w:pStyle w:val="Heading2"/>
       </w:pPr>
       <w:r>
-        <w:rPr>
-          <w:color w:val="1B2420"/>
-        </w:rPr>
-        <w:t>Running Call Audits, Start to Finish</w:t>
+        <w:t>1. Purpose</w:t>
+      </w:r>
+    </w:p>
+    <w:p>
+      <w:r>
+        <w:t>This manual is for day-to-day users of the QA Audit Platform. It explains how to log in, navigate the app, complete audits, assign calls, and use dashboard reports.</w:t>
       </w:r>
     </w:p>
     <w:p>
       <w:pPr>
-        <w:spacing w:after="360"/>
+        <w:pStyle w:val="Heading2"/>
       </w:pPr>
       <w:r>
-        <w:rPr>
-          <w:i/>
-          <w:color w:val="51594F"/>
-          <w:sz w:val="23"/>
-        </w:rPr>
-        <w:t>A working guide to the QA Audit Platform (home.py) for supervisors assigning calls and auditors scoring them -- what to click, in what order, and what happens behind the scenes.</w:t>
+        <w:t>2. Accessing the Platform</w:t>
+      </w:r>
+    </w:p>
+    <w:p>
+      <w:r>
+        <w:t>1. Open the app in your browser at the platform URL provided by your team.</w:t>
+      </w:r>
+    </w:p>
+    <w:p>
+      <w:r>
+        <w:t>2. Enter your username and password.</w:t>
+      </w:r>
+    </w:p>
+    <w:p>
+      <w:r>
+        <w:t>3. After login, you will land on the Home page.</w:t>
+      </w:r>
+    </w:p>
+    <w:p>
+      <w:r>
+        <w:t>If login fails, contact your supervisor or administrator to confirm your account access.</w:t>
       </w:r>
     </w:p>
     <w:p>
       <w:pPr>
-        <w:pStyle w:val="Heading1"/>
+        <w:pStyle w:val="Heading2"/>
       </w:pPr>
       <w:r>
-        <w:rPr>
-          <w:color w:val="1B2420"/>
-        </w:rPr>
-        <w:t>Getting Started</w:t>
+        <w:t>3. Navigation Overview</w:t>
+      </w:r>
+    </w:p>
+    <w:p>
+      <w:r>
+        <w:t>Use the left sidebar to switch between:</w:t>
       </w:r>
     </w:p>
     <w:p>
       <w:pPr>
-        <w:spacing w:after="200"/>
+        <w:pStyle w:val="ListBullet"/>
       </w:pPr>
       <w:r>
-        <w:rPr>
-          <w:b/>
-          <w:color w:val="51594F"/>
-          <w:sz w:val="16"/>
-        </w:rPr>
-        <w:t xml:space="preserve">  EVERYONE  </w:t>
+        <w:t>Home</w:t>
       </w:r>
     </w:p>
     <w:p>
       <w:pPr>
-        <w:spacing w:before="0" w:after="120"/>
+        <w:pStyle w:val="ListBullet"/>
       </w:pPr>
       <w:r>
-        <w:rPr>
-          <w:b w:val="0"/>
-          <w:i w:val="0"/>
-          <w:color w:val="51594F"/>
-          <w:sz w:val="22"/>
-        </w:rPr>
-        <w:t>Everything lives in one app. Open it, sign in, and the sidebar shows only what your role needs.</w:t>
+        <w:t>Tool</w:t>
       </w:r>
-    </w:p>
-    <w:tbl>
-      <w:tblPr>
-        <w:tblStyle w:val="TableGrid"/>
-        <w:tblW w:type="auto" w:w="0"/>
-        <w:tblLook w:firstColumn="1" w:firstRow="1" w:lastColumn="0" w:lastRow="0" w:noHBand="0" w:noVBand="1" w:val="04A0"/>
-      </w:tblPr>
-      <w:tblGrid>
-        <w:gridCol w:w="3249"/>
-        <w:gridCol w:w="3249"/>
-        <w:gridCol w:w="3249"/>
-      </w:tblGrid>
-      <w:tr>
-        <w:tc>
-          <w:tcPr>
-            <w:tcW w:type="dxa" w:w="3249"/>
-            <w:shd w:val="clear" w:color="auto" w:fill="1F6F42"/>
-          </w:tcPr>
-          <w:p>
-            <w:r/>
-            <w:r>
-              <w:rPr>
-                <w:b/>
-                <w:color w:val="FFFFFF"/>
-                <w:sz w:val="20"/>
-              </w:rPr>
-              <w:t>Role</w:t>
-            </w:r>
-          </w:p>
-        </w:tc>
-        <w:tc>
-          <w:tcPr>
-            <w:tcW w:type="dxa" w:w="3249"/>
-            <w:shd w:val="clear" w:color="auto" w:fill="1F6F42"/>
-          </w:tcPr>
-          <w:p>
-            <w:r/>
-            <w:r>
-              <w:rPr>
-                <w:b/>
-                <w:color w:val="FFFFFF"/>
-                <w:sz w:val="20"/>
-              </w:rPr>
-              <w:t>Tool mode shows</w:t>
-            </w:r>
-          </w:p>
-        </w:tc>
-        <w:tc>
-          <w:tcPr>
-            <w:tcW w:type="dxa" w:w="3249"/>
-            <w:shd w:val="clear" w:color="auto" w:fill="1F6F42"/>
-          </w:tcPr>
-          <w:p>
-            <w:r/>
-            <w:r>
-              <w:rPr>
-                <w:b/>
-                <w:color w:val="FFFFFF"/>
-                <w:sz w:val="20"/>
-              </w:rPr>
-              <w:t>Dashboard mode shows</w:t>
-            </w:r>
-          </w:p>
-        </w:tc>
-      </w:tr>
-      <w:tr>
-        <w:tc>
-          <w:tcPr>
-            <w:tcW w:type="dxa" w:w="3249"/>
-          </w:tcPr>
-          <w:p>
-            <w:r/>
-            <w:r>
-              <w:rPr>
-                <w:b/>
-                <w:sz w:val="20"/>
-              </w:rPr>
-              <w:t>Supervisor</w:t>
-            </w:r>
-          </w:p>
-        </w:tc>
-        <w:tc>
-          <w:tcPr>
-            <w:tcW w:type="dxa" w:w="3249"/>
-          </w:tcPr>
-          <w:p>
-            <w:r/>
-            <w:r>
-              <w:rPr>
-                <w:sz w:val="20"/>
-              </w:rPr>
-              <w:t>Call Assignment panel (hand out calls) plus the full call selector.</w:t>
-            </w:r>
-          </w:p>
-        </w:tc>
-        <w:tc>
-          <w:tcPr>
-            <w:tcW w:type="dxa" w:w="3249"/>
-          </w:tcPr>
-          <w:p>
-            <w:r/>
-            <w:r>
-              <w:rPr>
-                <w:sz w:val="20"/>
-              </w:rPr>
-              <w:t>All 6 tabs, including Unfinished Calls for tracking team progress.</w:t>
-            </w:r>
-          </w:p>
-        </w:tc>
-      </w:tr>
-      <w:tr>
-        <w:tc>
-          <w:tcPr>
-            <w:tcW w:type="dxa" w:w="3249"/>
-          </w:tcPr>
-          <w:p>
-            <w:r/>
-            <w:r>
-              <w:rPr>
-                <w:b/>
-                <w:sz w:val="20"/>
-              </w:rPr>
-              <w:t>Auditor</w:t>
-            </w:r>
-          </w:p>
-        </w:tc>
-        <w:tc>
-          <w:tcPr>
-            <w:tcW w:type="dxa" w:w="3249"/>
-          </w:tcPr>
-          <w:p>
-            <w:r/>
-            <w:r>
-              <w:rPr>
-                <w:sz w:val="20"/>
-              </w:rPr>
-              <w:t>Only your own assigned, unfinished calls -- no browsing other folders.</w:t>
-            </w:r>
-          </w:p>
-        </w:tc>
-        <w:tc>
-          <w:tcPr>
-            <w:tcW w:type="dxa" w:w="3249"/>
-          </w:tcPr>
-          <w:p>
-            <w:r/>
-            <w:r>
-              <w:rPr>
-                <w:sz w:val="20"/>
-              </w:rPr>
-              <w:t>All 6 tabs (read-only view of overall results).</w:t>
-            </w:r>
-          </w:p>
-        </w:tc>
-      </w:tr>
-      <w:tr>
-        <w:tc>
-          <w:tcPr>
-            <w:tcW w:type="dxa" w:w="3249"/>
-          </w:tcPr>
-          <w:p>
-            <w:r/>
-            <w:r>
-              <w:rPr>
-                <w:b/>
-                <w:sz w:val="20"/>
-              </w:rPr>
-              <w:t>Admin</w:t>
-            </w:r>
-          </w:p>
-        </w:tc>
-        <w:tc>
-          <w:tcPr>
-            <w:tcW w:type="dxa" w:w="3249"/>
-          </w:tcPr>
-          <w:p>
-            <w:r/>
-            <w:r>
-              <w:rPr>
-                <w:sz w:val="20"/>
-              </w:rPr>
-              <w:t>Full call selector, same as a supervisor without the assignment panel.</w:t>
-            </w:r>
-          </w:p>
-        </w:tc>
-        <w:tc>
-          <w:tcPr>
-            <w:tcW w:type="dxa" w:w="3249"/>
-          </w:tcPr>
-          <w:p>
-            <w:r/>
-            <w:r>
-              <w:rPr>
-                <w:sz w:val="20"/>
-              </w:rPr>
-              <w:t>All 6 tabs.</w:t>
-            </w:r>
-          </w:p>
-        </w:tc>
-      </w:tr>
-    </w:tbl>
-    <w:p>
-      <w:pPr>
-        <w:spacing w:after="80"/>
-      </w:pPr>
     </w:p>
     <w:p>
       <w:pPr>
-        <w:spacing w:after="80"/>
+        <w:pStyle w:val="ListBullet"/>
       </w:pPr>
       <w:r>
-        <w:rPr>
-          <w:b/>
-          <w:color w:val="1F6F42"/>
-          <w:sz w:val="20"/>
-        </w:rPr>
-        <w:t xml:space="preserve">TIP:  </w:t>
-      </w:r>
-      <w:r>
-        <w:rPr>
-          <w:i/>
-          <w:sz w:val="20"/>
-        </w:rPr>
-        <w:t>Use the sidebar radio to switch between Home, Tool, and Dashboard mode at any time -- your place in each is remembered.</w:t>
+        <w:t>Dashboard (visible for roles with dashboard access)</w:t>
       </w:r>
     </w:p>
     <w:p>
       <w:r>
-        <w:br w:type="page"/>
+        <w:t>The sidebar also shows your role and includes the Logout button.</w:t>
       </w:r>
     </w:p>
     <w:p>
       <w:pPr>
-        <w:pStyle w:val="Heading1"/>
+        <w:pStyle w:val="Heading2"/>
       </w:pPr>
       <w:r>
-        <w:rPr>
-          <w:color w:val="1B2420"/>
-        </w:rPr>
-        <w:t>Supervisor Workflow</w:t>
+        <w:t>4. Home Page</w:t>
+      </w:r>
+    </w:p>
+    <w:p>
+      <w:r>
+        <w:t>The Home page provides:</w:t>
       </w:r>
     </w:p>
     <w:p>
       <w:pPr>
-        <w:spacing w:after="200"/>
+        <w:pStyle w:val="ListBullet"/>
       </w:pPr>
       <w:r>
-        <w:rPr>
-          <w:b/>
-          <w:color w:val="1F6F42"/>
-          <w:sz w:val="16"/>
-        </w:rPr>
-        <w:t xml:space="preserve">  SUPERVISOR  </w:t>
+        <w:t>Quick navigation cards to Tool and Dashboard</w:t>
       </w:r>
     </w:p>
     <w:p>
       <w:pPr>
-        <w:spacing w:before="0" w:after="120"/>
+        <w:pStyle w:val="ListBullet"/>
       </w:pPr>
       <w:r>
-        <w:rPr>
-          <w:b w:val="0"/>
-          <w:i w:val="0"/>
-          <w:color w:val="51594F"/>
-          <w:sz w:val="22"/>
-        </w:rPr>
-        <w:t>Assigning calls is a three-decision process -- who, how many, and from where -- followed by one click.</w:t>
-      </w:r>
-    </w:p>
-    <w:tbl>
-      <w:tblPr>
-        <w:tblW w:type="auto" w:w="0"/>
-        <w:tblLayout w:type="autofit"/>
-        <w:tblLook w:firstColumn="1" w:firstRow="1" w:lastColumn="0" w:lastRow="0" w:noHBand="0" w:noVBand="1" w:val="04A0"/>
-      </w:tblPr>
-      <w:tblGrid>
-        <w:gridCol w:w="1949"/>
-        <w:gridCol w:w="1949"/>
-        <w:gridCol w:w="1949"/>
-        <w:gridCol w:w="1949"/>
-        <w:gridCol w:w="1949"/>
-      </w:tblGrid>
-      <w:tr>
-        <w:tc>
-          <w:tcPr>
-            <w:tcW w:type="dxa" w:w="1949"/>
-            <w:shd w:val="clear" w:color="auto" w:fill="1F6F42"/>
-            <w:tcBorders>
-              <w:top w:val="single" w:sz="12" w:color="FFFFFF"/>
-              <w:left w:val="single" w:sz="12" w:color="FFFFFF"/>
-              <w:bottom w:val="single" w:sz="12" w:color="FFFFFF"/>
-              <w:right w:val="single" w:sz="12" w:color="FFFFFF"/>
-            </w:tcBorders>
-            <w:vAlign w:val="center"/>
-          </w:tcPr>
-          <w:p>
-            <w:pPr>
-              <w:jc w:val="center"/>
-            </w:pPr>
-            <w:r>
-              <w:rPr>
-                <w:b/>
-                <w:color w:val="FFFFFF"/>
-                <w:sz w:val="20"/>
-              </w:rPr>
-              <w:t>1. Select</w:t>
-            </w:r>
-            <w:r>
-              <w:br/>
-            </w:r>
-            <w:r>
-              <w:rPr>
-                <w:b/>
-                <w:color w:val="FFFFFF"/>
-                <w:sz w:val="20"/>
-              </w:rPr>
-              <w:t>Auditors</w:t>
-            </w:r>
-          </w:p>
-        </w:tc>
-        <w:tc>
-          <w:tcPr>
-            <w:tcW w:type="dxa" w:w="1949"/>
-            <w:shd w:val="clear" w:color="auto" w:fill="1F6F42"/>
-            <w:tcBorders>
-              <w:top w:val="single" w:sz="12" w:color="FFFFFF"/>
-              <w:left w:val="single" w:sz="12" w:color="FFFFFF"/>
-              <w:bottom w:val="single" w:sz="12" w:color="FFFFFF"/>
-              <w:right w:val="single" w:sz="12" w:color="FFFFFF"/>
-            </w:tcBorders>
-            <w:vAlign w:val="center"/>
-          </w:tcPr>
-          <w:p>
-            <w:pPr>
-              <w:jc w:val="center"/>
-            </w:pPr>
-            <w:r>
-              <w:rPr>
-                <w:b/>
-                <w:color w:val="FFFFFF"/>
-                <w:sz w:val="20"/>
-              </w:rPr>
-              <w:t>2. Calls per</w:t>
-            </w:r>
-            <w:r>
-              <w:br/>
-            </w:r>
-            <w:r>
-              <w:rPr>
-                <w:b/>
-                <w:color w:val="FFFFFF"/>
-                <w:sz w:val="20"/>
-              </w:rPr>
-              <w:t>Auditor</w:t>
-            </w:r>
-          </w:p>
-        </w:tc>
-        <w:tc>
-          <w:tcPr>
-            <w:tcW w:type="dxa" w:w="1949"/>
-            <w:shd w:val="clear" w:color="auto" w:fill="1F6F42"/>
-            <w:tcBorders>
-              <w:top w:val="single" w:sz="12" w:color="FFFFFF"/>
-              <w:left w:val="single" w:sz="12" w:color="FFFFFF"/>
-              <w:bottom w:val="single" w:sz="12" w:color="FFFFFF"/>
-              <w:right w:val="single" w:sz="12" w:color="FFFFFF"/>
-            </w:tcBorders>
-            <w:vAlign w:val="center"/>
-          </w:tcPr>
-          <w:p>
-            <w:pPr>
-              <w:jc w:val="center"/>
-            </w:pPr>
-            <w:r>
-              <w:rPr>
-                <w:b/>
-                <w:color w:val="FFFFFF"/>
-                <w:sz w:val="20"/>
-              </w:rPr>
-              <w:t>3. Call</w:t>
-            </w:r>
-            <w:r>
-              <w:br/>
-            </w:r>
-            <w:r>
-              <w:rPr>
-                <w:b/>
-                <w:color w:val="FFFFFF"/>
-                <w:sz w:val="20"/>
-              </w:rPr>
-              <w:t>Source</w:t>
-            </w:r>
-          </w:p>
-        </w:tc>
-        <w:tc>
-          <w:tcPr>
-            <w:tcW w:type="dxa" w:w="1949"/>
-            <w:shd w:val="clear" w:color="auto" w:fill="1F6F42"/>
-            <w:tcBorders>
-              <w:top w:val="single" w:sz="12" w:color="FFFFFF"/>
-              <w:left w:val="single" w:sz="12" w:color="FFFFFF"/>
-              <w:bottom w:val="single" w:sz="12" w:color="FFFFFF"/>
-              <w:right w:val="single" w:sz="12" w:color="FFFFFF"/>
-            </w:tcBorders>
-            <w:vAlign w:val="center"/>
-          </w:tcPr>
-          <w:p>
-            <w:pPr>
-              <w:jc w:val="center"/>
-            </w:pPr>
-            <w:r>
-              <w:rPr>
-                <w:b/>
-                <w:color w:val="FFFFFF"/>
-                <w:sz w:val="20"/>
-              </w:rPr>
-              <w:t>4. Assign</w:t>
-            </w:r>
-            <w:r>
-              <w:br/>
-            </w:r>
-            <w:r>
-              <w:rPr>
-                <w:b/>
-                <w:color w:val="FFFFFF"/>
-                <w:sz w:val="20"/>
-              </w:rPr>
-              <w:t>Calls</w:t>
-            </w:r>
-          </w:p>
-        </w:tc>
-        <w:tc>
-          <w:tcPr>
-            <w:tcW w:type="dxa" w:w="1949"/>
-            <w:shd w:val="clear" w:color="auto" w:fill="1F6F42"/>
-            <w:tcBorders>
-              <w:top w:val="single" w:sz="12" w:color="FFFFFF"/>
-              <w:left w:val="single" w:sz="12" w:color="FFFFFF"/>
-              <w:bottom w:val="single" w:sz="12" w:color="FFFFFF"/>
-              <w:right w:val="single" w:sz="12" w:color="FFFFFF"/>
-            </w:tcBorders>
-            <w:vAlign w:val="center"/>
-          </w:tcPr>
-          <w:p>
-            <w:pPr>
-              <w:jc w:val="center"/>
-            </w:pPr>
-            <w:r>
-              <w:rPr>
-                <w:b/>
-                <w:color w:val="FFFFFF"/>
-                <w:sz w:val="20"/>
-              </w:rPr>
-              <w:t>5. Track in</w:t>
-            </w:r>
-            <w:r>
-              <w:br/>
-            </w:r>
-            <w:r>
-              <w:rPr>
-                <w:b/>
-                <w:color w:val="FFFFFF"/>
-                <w:sz w:val="20"/>
-              </w:rPr>
-              <w:t>Dashboard</w:t>
-            </w:r>
-          </w:p>
-        </w:tc>
-      </w:tr>
-    </w:tbl>
-    <w:p>
-      <w:pPr>
-        <w:spacing w:after="40"/>
-      </w:pPr>
-    </w:p>
-    <w:p>
-      <w:pPr>
-        <w:spacing w:before="200" w:after="40"/>
-      </w:pPr>
-      <w:r>
-        <w:rPr>
-          <w:b/>
-          <w:color w:val="1F6F42"/>
-          <w:sz w:val="25"/>
-        </w:rPr>
-        <w:t>1.  Select your auditors</w:t>
+        <w:t>Platform information</w:t>
       </w:r>
     </w:p>
     <w:p>
       <w:pPr>
-        <w:spacing w:after="80"/>
-        <w:ind w:left="360"/>
+        <w:pStyle w:val="ListBullet"/>
       </w:pPr>
       <w:r>
-        <w:rPr>
-          <w:sz w:val="21"/>
-        </w:rPr>
-        <w:t>In Tool mode, under Supervisor Dashboard -- Call Assignment, set "1. Select Auditors" to how many people are auditing this round, then pick them by name.</w:t>
+        <w:t>Quick Stats from existing audit logs</w:t>
+      </w:r>
+    </w:p>
+    <w:p>
+      <w:r>
+        <w:t>Use this page as your starting point each session.</w:t>
       </w:r>
     </w:p>
     <w:p>
       <w:pPr>
-        <w:spacing w:before="200" w:after="40"/>
+        <w:pStyle w:val="Heading2"/>
       </w:pPr>
       <w:r>
-        <w:rPr>
-          <w:b/>
-          <w:color w:val="1F6F42"/>
-          <w:sz w:val="25"/>
-        </w:rPr>
-        <w:t>2.  Set calls per auditor</w:t>
+        <w:t>5. Tool Page</w:t>
+      </w:r>
+    </w:p>
+    <w:p>
+      <w:r>
+        <w:t>The Tool page behavior changes by role.</w:t>
       </w:r>
     </w:p>
     <w:p>
       <w:pPr>
-        <w:spacing w:after="80"/>
-        <w:ind w:left="360"/>
+        <w:pStyle w:val="Heading3"/>
       </w:pPr>
       <w:r>
-        <w:rPr>
-          <w:sz w:val="21"/>
-        </w:rPr>
-        <w:t>Under "2. Calls per Auditor", enter how many calls each person should get. Totals don't need to match exactly -- leave any auditor at 0 if they're sitting this round out.</w:t>
+        <w:t>5.1 Supervisor workflow (Call Assignment)</w:t>
+      </w:r>
+    </w:p>
+    <w:p>
+      <w:r>
+        <w:t>1. Open Tool.</w:t>
+      </w:r>
+    </w:p>
+    <w:p>
+      <w:r>
+        <w:t>2. Select participating auditors.</w:t>
+      </w:r>
+    </w:p>
+    <w:p>
+      <w:r>
+        <w:t>3. Set number of calls per auditor.</w:t>
+      </w:r>
+    </w:p>
+    <w:p>
+      <w:r>
+        <w:t>4. Confirm the call source folder.</w:t>
+      </w:r>
+    </w:p>
+    <w:p>
+      <w:r>
+        <w:t>5. Click Assign Calls.</w:t>
+      </w:r>
+    </w:p>
+    <w:p>
+      <w:r>
+        <w:t>6. Review the latest assignment batch.</w:t>
+      </w:r>
+    </w:p>
+    <w:p>
+      <w:r>
+        <w:t>7. Optionally download the assignment batch Excel file.</w:t>
+      </w:r>
+    </w:p>
+    <w:p>
+      <w:r>
+        <w:t>Notes:</w:t>
       </w:r>
     </w:p>
     <w:p>
       <w:pPr>
-        <w:spacing w:before="200" w:after="40"/>
+        <w:pStyle w:val="ListBullet"/>
       </w:pPr>
       <w:r>
-        <w:rPr>
-          <w:b/>
-          <w:color w:val="1F6F42"/>
-          <w:sz w:val="25"/>
-        </w:rPr>
-        <w:t>3.  Point at the call source</w:t>
+        <w:t>Assignments are stored in Call_Assignments/call_assignments.xlsx.</w:t>
       </w:r>
     </w:p>
     <w:p>
       <w:pPr>
-        <w:spacing w:after="80"/>
-        <w:ind w:left="360"/>
+        <w:pStyle w:val="ListBullet"/>
       </w:pPr>
       <w:r>
-        <w:rPr>
-          <w:sz w:val="21"/>
-        </w:rPr>
-        <w:t>Under "3. Call Source", confirm the folder of recordings (defaults to New call list/). Leave "Allow reassigning" unchecked unless you deliberately want to re-audit calls that were already handed out.</w:t>
+        <w:t>If reassigning is disabled, already assigned calls are excluded.</w:t>
       </w:r>
     </w:p>
     <w:p>
       <w:pPr>
-        <w:spacing w:before="200" w:after="40"/>
+        <w:pStyle w:val="Heading3"/>
       </w:pPr>
       <w:r>
-        <w:rPr>
-          <w:b/>
-          <w:color w:val="1F6F42"/>
-          <w:sz w:val="25"/>
-        </w:rPr>
-        <w:t>4.  Assign, then verify</w:t>
+        <w:t>5.2 Auditor workflow (Audit assigned calls)</w:t>
+      </w:r>
+    </w:p>
+    <w:p>
+      <w:r>
+        <w:t>1. Open Tool.</w:t>
+      </w:r>
+    </w:p>
+    <w:p>
+      <w:r>
+        <w:t>2. Click Load My Assigned Calls.</w:t>
+      </w:r>
+    </w:p>
+    <w:p>
+      <w:r>
+        <w:t>3. Review each call shown in your queue.</w:t>
+      </w:r>
+    </w:p>
+    <w:p>
+      <w:r>
+        <w:t>4. Complete all required metadata and quality questions.</w:t>
+      </w:r>
+    </w:p>
+    <w:p>
+      <w:r>
+        <w:t>5. Add optional comments.</w:t>
+      </w:r>
+    </w:p>
+    <w:p>
+      <w:r>
+        <w:t>6. Click Save Audit Log.</w:t>
+      </w:r>
+    </w:p>
+    <w:p>
+      <w:r>
+        <w:t>Notes:</w:t>
       </w:r>
     </w:p>
     <w:p>
       <w:pPr>
-        <w:spacing w:after="80"/>
-        <w:ind w:left="360"/>
+        <w:pStyle w:val="ListBullet"/>
       </w:pPr>
       <w:r>
-        <w:rPr>
-          <w:sz w:val="21"/>
-        </w:rPr>
-        <w:t>Click "Assign Calls". The batch appears under "Latest Assignment Batch" with a download button, and folds into "All Assignments on Record" for history.</w:t>
+        <w:t>Auditors only work on calls assigned to their account.</w:t>
       </w:r>
     </w:p>
     <w:p>
       <w:pPr>
-        <w:spacing w:after="160"/>
-        <w:ind w:left="360"/>
+        <w:pStyle w:val="ListBullet"/>
       </w:pPr>
       <w:r>
-        <w:rPr>
-          <w:b/>
-          <w:color w:val="A8791F"/>
-          <w:sz w:val="20"/>
-        </w:rPr>
-        <w:t xml:space="preserve">Watch for:  </w:t>
-      </w:r>
-      <w:r>
-        <w:rPr>
-          <w:i/>
-          <w:sz w:val="20"/>
-        </w:rPr>
-        <w:t>If you see "Only N unassigned call(s) available...", the source folder has fewer fresh calls than you asked for -- calls are still split as evenly as possible.</w:t>
+        <w:t>Completed calls are removed from unfinished queues automatically.</w:t>
       </w:r>
     </w:p>
     <w:p>
       <w:pPr>
-        <w:spacing w:before="200" w:after="40"/>
+        <w:pStyle w:val="Heading3"/>
       </w:pPr>
       <w:r>
-        <w:rPr>
-          <w:b/>
-          <w:color w:val="1F6F42"/>
-          <w:sz w:val="25"/>
-        </w:rPr>
-        <w:t>5.  Track completion</w:t>
+        <w:t>5.3 Completing the audit form</w:t>
+      </w:r>
+    </w:p>
+    <w:p>
+      <w:r>
+        <w:t>For each selected call:</w:t>
+      </w:r>
+    </w:p>
+    <w:p>
+      <w:r>
+        <w:t>1. Verify call metadata.</w:t>
+      </w:r>
+    </w:p>
+    <w:p>
+      <w:r>
+        <w:t>2. Score each quality metric as instructed.</w:t>
+      </w:r>
+    </w:p>
+    <w:p>
+      <w:r>
+        <w:t>3. Fill mandatory text fields.</w:t>
+      </w:r>
+    </w:p>
+    <w:p>
+      <w:r>
+        <w:t>4. Mark N/A only where appropriate.</w:t>
+      </w:r>
+    </w:p>
+    <w:p>
+      <w:r>
+        <w:t>5. Save when all required entries are complete.</w:t>
       </w:r>
     </w:p>
     <w:p>
       <w:pPr>
-        <w:spacing w:after="80"/>
-        <w:ind w:left="360"/>
+        <w:pStyle w:val="Heading2"/>
       </w:pPr>
       <w:r>
-        <w:rPr>
-          <w:sz w:val="21"/>
-        </w:rPr>
-        <w:t>Open Dashboard -&gt; Unfinished Calls at any time to see, per auditor, how many calls are still outstanding and what percentage of their workload that represents.</w:t>
+        <w:t>6. Dashboard Page</w:t>
       </w:r>
     </w:p>
     <w:p>
       <w:r>
-        <w:br w:type="page"/>
+        <w:t>The Dashboard is used for analysis and reporting.</w:t>
       </w:r>
     </w:p>
     <w:p>
       <w:pPr>
-        <w:pStyle w:val="Heading1"/>
+        <w:pStyle w:val="Heading3"/>
       </w:pPr>
       <w:r>
-        <w:rPr>
-          <w:color w:val="1B2420"/>
-        </w:rPr>
-        <w:t>Auditor Workflow</w:t>
+        <w:t>6.1 Filters</w:t>
+      </w:r>
+    </w:p>
+    <w:p>
+      <w:r>
+        <w:t>Use sidebar filters to narrow data by:</w:t>
       </w:r>
     </w:p>
     <w:p>
       <w:pPr>
-        <w:spacing w:after="200"/>
+        <w:pStyle w:val="ListBullet"/>
       </w:pPr>
       <w:r>
-        <w:rPr>
-          <w:b/>
-          <w:color w:val="2B6F86"/>
-          <w:sz w:val="16"/>
-        </w:rPr>
-        <w:t xml:space="preserve">  AUDITOR  </w:t>
+        <w:t>Date range</w:t>
       </w:r>
     </w:p>
     <w:p>
       <w:pPr>
-        <w:spacing w:before="0" w:after="120"/>
+        <w:pStyle w:val="ListBullet"/>
       </w:pPr>
       <w:r>
-        <w:rPr>
-          <w:b w:val="0"/>
-          <w:i w:val="0"/>
-          <w:color w:val="51594F"/>
-          <w:sz w:val="22"/>
-        </w:rPr>
-        <w:t>You only ever see calls that were assigned to you -- and only the ones you haven't scored yet.</w:t>
-      </w:r>
-    </w:p>
-    <w:tbl>
-      <w:tblPr>
-        <w:tblW w:type="auto" w:w="0"/>
-        <w:tblLayout w:type="autofit"/>
-        <w:tblLook w:firstColumn="1" w:firstRow="1" w:lastColumn="0" w:lastRow="0" w:noHBand="0" w:noVBand="1" w:val="04A0"/>
-      </w:tblPr>
-      <w:tblGrid>
-        <w:gridCol w:w="1949"/>
-        <w:gridCol w:w="1949"/>
-        <w:gridCol w:w="1949"/>
-        <w:gridCol w:w="1949"/>
-        <w:gridCol w:w="1949"/>
-      </w:tblGrid>
-      <w:tr>
-        <w:tc>
-          <w:tcPr>
-            <w:tcW w:type="dxa" w:w="1949"/>
-            <w:shd w:val="clear" w:color="auto" w:fill="2B6F86"/>
-            <w:tcBorders>
-              <w:top w:val="single" w:sz="12" w:color="FFFFFF"/>
-              <w:left w:val="single" w:sz="12" w:color="FFFFFF"/>
-              <w:bottom w:val="single" w:sz="12" w:color="FFFFFF"/>
-              <w:right w:val="single" w:sz="12" w:color="FFFFFF"/>
-            </w:tcBorders>
-            <w:vAlign w:val="center"/>
-          </w:tcPr>
-          <w:p>
-            <w:pPr>
-              <w:jc w:val="center"/>
-            </w:pPr>
-            <w:r>
-              <w:rPr>
-                <w:b/>
-                <w:color w:val="FFFFFF"/>
-                <w:sz w:val="20"/>
-              </w:rPr>
-              <w:t>1. My Assigned</w:t>
-            </w:r>
-            <w:r>
-              <w:br/>
-            </w:r>
-            <w:r>
-              <w:rPr>
-                <w:b/>
-                <w:color w:val="FFFFFF"/>
-                <w:sz w:val="20"/>
-              </w:rPr>
-              <w:t>Calls</w:t>
-            </w:r>
-          </w:p>
-        </w:tc>
-        <w:tc>
-          <w:tcPr>
-            <w:tcW w:type="dxa" w:w="1949"/>
-            <w:shd w:val="clear" w:color="auto" w:fill="2B6F86"/>
-            <w:tcBorders>
-              <w:top w:val="single" w:sz="12" w:color="FFFFFF"/>
-              <w:left w:val="single" w:sz="12" w:color="FFFFFF"/>
-              <w:bottom w:val="single" w:sz="12" w:color="FFFFFF"/>
-              <w:right w:val="single" w:sz="12" w:color="FFFFFF"/>
-            </w:tcBorders>
-            <w:vAlign w:val="center"/>
-          </w:tcPr>
-          <w:p>
-            <w:pPr>
-              <w:jc w:val="center"/>
-            </w:pPr>
-            <w:r>
-              <w:rPr>
-                <w:b/>
-                <w:color w:val="FFFFFF"/>
-                <w:sz w:val="20"/>
-              </w:rPr>
-              <w:t>2. Load</w:t>
-            </w:r>
-            <w:r>
-              <w:br/>
-            </w:r>
-            <w:r>
-              <w:rPr>
-                <w:b/>
-                <w:color w:val="FFFFFF"/>
-                <w:sz w:val="20"/>
-              </w:rPr>
-              <w:t>Unfinished</w:t>
-            </w:r>
-          </w:p>
-        </w:tc>
-        <w:tc>
-          <w:tcPr>
-            <w:tcW w:type="dxa" w:w="1949"/>
-            <w:shd w:val="clear" w:color="auto" w:fill="2B6F86"/>
-            <w:tcBorders>
-              <w:top w:val="single" w:sz="12" w:color="FFFFFF"/>
-              <w:left w:val="single" w:sz="12" w:color="FFFFFF"/>
-              <w:bottom w:val="single" w:sz="12" w:color="FFFFFF"/>
-              <w:right w:val="single" w:sz="12" w:color="FFFFFF"/>
-            </w:tcBorders>
-            <w:vAlign w:val="center"/>
-          </w:tcPr>
-          <w:p>
-            <w:pPr>
-              <w:jc w:val="center"/>
-            </w:pPr>
-            <w:r>
-              <w:rPr>
-                <w:b/>
-                <w:color w:val="FFFFFF"/>
-                <w:sz w:val="20"/>
-              </w:rPr>
-              <w:t>3. Listen &amp;</w:t>
-            </w:r>
-            <w:r>
-              <w:br/>
-            </w:r>
-            <w:r>
-              <w:rPr>
-                <w:b/>
-                <w:color w:val="FFFFFF"/>
-                <w:sz w:val="20"/>
-              </w:rPr>
-              <w:t>Score</w:t>
-            </w:r>
-          </w:p>
-        </w:tc>
-        <w:tc>
-          <w:tcPr>
-            <w:tcW w:type="dxa" w:w="1949"/>
-            <w:shd w:val="clear" w:color="auto" w:fill="2B6F86"/>
-            <w:tcBorders>
-              <w:top w:val="single" w:sz="12" w:color="FFFFFF"/>
-              <w:left w:val="single" w:sz="12" w:color="FFFFFF"/>
-              <w:bottom w:val="single" w:sz="12" w:color="FFFFFF"/>
-              <w:right w:val="single" w:sz="12" w:color="FFFFFF"/>
-            </w:tcBorders>
-            <w:vAlign w:val="center"/>
-          </w:tcPr>
-          <w:p>
-            <w:pPr>
-              <w:jc w:val="center"/>
-            </w:pPr>
-            <w:r>
-              <w:rPr>
-                <w:b/>
-                <w:color w:val="FFFFFF"/>
-                <w:sz w:val="20"/>
-              </w:rPr>
-              <w:t>4. Save Audit</w:t>
-            </w:r>
-            <w:r>
-              <w:br/>
-            </w:r>
-            <w:r>
-              <w:rPr>
-                <w:b/>
-                <w:color w:val="FFFFFF"/>
-                <w:sz w:val="20"/>
-              </w:rPr>
-              <w:t>Log</w:t>
-            </w:r>
-          </w:p>
-        </w:tc>
-        <w:tc>
-          <w:tcPr>
-            <w:tcW w:type="dxa" w:w="1949"/>
-            <w:shd w:val="clear" w:color="auto" w:fill="2B6F86"/>
-            <w:tcBorders>
-              <w:top w:val="single" w:sz="12" w:color="FFFFFF"/>
-              <w:left w:val="single" w:sz="12" w:color="FFFFFF"/>
-              <w:bottom w:val="single" w:sz="12" w:color="FFFFFF"/>
-              <w:right w:val="single" w:sz="12" w:color="FFFFFF"/>
-            </w:tcBorders>
-            <w:vAlign w:val="center"/>
-          </w:tcPr>
-          <w:p>
-            <w:pPr>
-              <w:jc w:val="center"/>
-            </w:pPr>
-            <w:r>
-              <w:rPr>
-                <w:b/>
-                <w:color w:val="FFFFFF"/>
-                <w:sz w:val="20"/>
-              </w:rPr>
-              <w:t>5. Drops off</w:t>
-            </w:r>
-            <w:r>
-              <w:br/>
-            </w:r>
-            <w:r>
-              <w:rPr>
-                <w:b/>
-                <w:color w:val="FFFFFF"/>
-                <w:sz w:val="20"/>
-              </w:rPr>
-              <w:t>your list</w:t>
-            </w:r>
-          </w:p>
-        </w:tc>
-      </w:tr>
-    </w:tbl>
-    <w:p>
-      <w:pPr>
-        <w:spacing w:after="40"/>
-      </w:pPr>
-    </w:p>
-    <w:p>
-      <w:pPr>
-        <w:spacing w:before="200" w:after="40"/>
-      </w:pPr>
-      <w:r>
-        <w:rPr>
-          <w:b/>
-          <w:color w:val="2B6F86"/>
-          <w:sz w:val="25"/>
-        </w:rPr>
-        <w:t>1.  Check your assignment list</w:t>
+        <w:t>Agent</w:t>
       </w:r>
     </w:p>
     <w:p>
       <w:pPr>
-        <w:spacing w:after="80"/>
-        <w:ind w:left="360"/>
+        <w:pStyle w:val="ListBullet"/>
       </w:pPr>
       <w:r>
-        <w:rPr>
-          <w:sz w:val="21"/>
-        </w:rPr>
-        <w:t>In Tool mode you'll see "My Assigned Calls" -- every call a supervisor has ever handed to you, with a message telling you how many are still unfinished.</w:t>
+        <w:t>Score range</w:t>
       </w:r>
     </w:p>
     <w:p>
       <w:pPr>
-        <w:spacing w:before="200" w:after="40"/>
+        <w:pStyle w:val="Heading3"/>
       </w:pPr>
       <w:r>
-        <w:rPr>
-          <w:b/>
-          <w:color w:val="2B6F86"/>
-          <w:sz w:val="25"/>
-        </w:rPr>
-        <w:t>2.  Load your unfinished calls</w:t>
+        <w:t>6.2 Tabs</w:t>
+      </w:r>
+    </w:p>
+    <w:p>
+      <w:r>
+        <w:t>Main tabs include:</w:t>
       </w:r>
     </w:p>
     <w:p>
       <w:pPr>
-        <w:spacing w:after="80"/>
-        <w:ind w:left="360"/>
+        <w:pStyle w:val="ListBullet"/>
       </w:pPr>
       <w:r>
-        <w:rPr>
-          <w:sz w:val="21"/>
-        </w:rPr>
-        <w:t>Click "Load My Assigned Calls". This pulls in every call still outstanding for you -- you don't choose a folder or a sample size, because the list is already scoped to exactly your work.</w:t>
+        <w:t>Overview</w:t>
       </w:r>
     </w:p>
     <w:p>
       <w:pPr>
-        <w:spacing w:before="200" w:after="40"/>
+        <w:pStyle w:val="ListBullet"/>
       </w:pPr>
       <w:r>
-        <w:rPr>
-          <w:b/>
-          <w:color w:val="2B6F86"/>
-          <w:sz w:val="25"/>
-        </w:rPr>
-        <w:t>3.  Listen and score each call</w:t>
+        <w:t>Agent Performance</w:t>
       </w:r>
     </w:p>
     <w:p>
       <w:pPr>
-        <w:spacing w:after="80"/>
-        <w:ind w:left="360"/>
+        <w:pStyle w:val="ListBullet"/>
       </w:pPr>
       <w:r>
-        <w:rPr>
-          <w:sz w:val="21"/>
-        </w:rPr>
-        <w:t>For every call: play the audio, fill in caller metadata, and answer each benchmark question (greeting, needs identification, professionalism, empathy, and so on). Use "Cancel (N/A)" for a call that can't be scored.</w:t>
+        <w:t>Timeline</w:t>
       </w:r>
     </w:p>
     <w:p>
       <w:pPr>
-        <w:spacing w:after="80"/>
-        <w:ind w:left="360"/>
+        <w:pStyle w:val="ListBullet"/>
       </w:pPr>
       <w:r>
-        <w:rPr>
-          <w:sz w:val="21"/>
-        </w:rPr>
-        <w:t>Scores are weighted to the agreed benchmark -- you don't need to calculate anything. Comments are optional but appear in the Dashboard's Comments tab.</w:t>
+        <w:t>Comments</w:t>
       </w:r>
     </w:p>
     <w:p>
       <w:pPr>
-        <w:spacing w:before="200" w:after="40"/>
+        <w:pStyle w:val="ListBullet"/>
       </w:pPr>
       <w:r>
-        <w:rPr>
-          <w:b/>
-          <w:color w:val="2B6F86"/>
-          <w:sz w:val="25"/>
-        </w:rPr>
-        <w:t>4.  Save your audit log</w:t>
+        <w:t>Raw Data</w:t>
       </w:r>
     </w:p>
     <w:p>
       <w:pPr>
-        <w:spacing w:after="80"/>
-        <w:ind w:left="360"/>
+        <w:pStyle w:val="ListBullet"/>
       </w:pPr>
       <w:r>
-        <w:rPr>
-          <w:sz w:val="21"/>
-        </w:rPr>
-        <w:t>Click "Save Audit Log". Your results are written to a timestamped file in Audit_log_calls/ and that call disappears from your unfinished list on the next load.</w:t>
+        <w:t>Unfinished Calls</w:t>
       </w:r>
     </w:p>
     <w:p>
       <w:pPr>
-        <w:spacing w:after="160"/>
-        <w:ind w:left="360"/>
+        <w:pStyle w:val="Heading3"/>
       </w:pPr>
       <w:r>
-        <w:rPr>
-          <w:b/>
-          <w:color w:val="1F6F42"/>
-          <w:sz w:val="20"/>
-        </w:rPr>
-        <w:t xml:space="preserve">Why it disappears:  </w:t>
-      </w:r>
-      <w:r>
-        <w:rPr>
-          <w:i/>
-          <w:sz w:val="20"/>
-        </w:rPr>
-        <w:t>The app checks every saved audit log for the call's file name -- once it's there, the call counts as done, whether you scored it or marked it N/A.</w:t>
+        <w:t>6.3 Exporting reports</w:t>
       </w:r>
     </w:p>
     <w:p>
       <w:r>
-        <w:br w:type="page"/>
+        <w:t>1. Open Raw Data tab.</w:t>
+      </w:r>
+    </w:p>
+    <w:p>
+      <w:r>
+        <w:t>2. Apply desired filters first.</w:t>
+      </w:r>
+    </w:p>
+    <w:p>
+      <w:r>
+        <w:t>3. Use the export button to generate the Excel report.</w:t>
       </w:r>
     </w:p>
     <w:p>
       <w:pPr>
-        <w:pStyle w:val="Heading1"/>
+        <w:pStyle w:val="Heading2"/>
       </w:pPr>
       <w:r>
-        <w:rPr>
-          <w:color w:val="1B2420"/>
-        </w:rPr>
-        <w:t>Dashboard Tour</w:t>
+        <w:t>7. Saving and Data Locations</w:t>
+      </w:r>
+    </w:p>
+    <w:p>
+      <w:r>
+        <w:t>Generated and updated files are stored in:</w:t>
       </w:r>
     </w:p>
     <w:p>
       <w:pPr>
-        <w:spacing w:after="200"/>
+        <w:pStyle w:val="ListBullet"/>
       </w:pPr>
       <w:r>
-        <w:rPr>
-          <w:b/>
-          <w:color w:val="51594F"/>
-          <w:sz w:val="16"/>
-        </w:rPr>
-        <w:t xml:space="preserve">  EVERYONE  </w:t>
+        <w:t>Audit logs: Audit_log_calls/</w:t>
       </w:r>
     </w:p>
     <w:p>
       <w:pPr>
-        <w:spacing w:before="0" w:after="120"/>
+        <w:pStyle w:val="ListBullet"/>
       </w:pPr>
       <w:r>
-        <w:rPr>
-          <w:b w:val="0"/>
-          <w:i w:val="0"/>
-          <w:color w:val="51594F"/>
-          <w:sz w:val="22"/>
-        </w:rPr>
-        <w:t>Six tabs, all built from the same saved audit logs -- filter by date, agent, or score in the sidebar first.</w:t>
-      </w:r>
-    </w:p>
-    <w:tbl>
-      <w:tblPr>
-        <w:tblStyle w:val="TableGrid"/>
-        <w:tblW w:type="auto" w:w="0"/>
-        <w:tblLook w:firstColumn="1" w:firstRow="1" w:lastColumn="0" w:lastRow="0" w:noHBand="0" w:noVBand="1" w:val="04A0"/>
-      </w:tblPr>
-      <w:tblGrid>
-        <w:gridCol w:w="3249"/>
-        <w:gridCol w:w="3249"/>
-        <w:gridCol w:w="3249"/>
-      </w:tblGrid>
-      <w:tr>
-        <w:tc>
-          <w:tcPr>
-            <w:tcW w:type="dxa" w:w="3249"/>
-            <w:shd w:val="clear" w:color="auto" w:fill="1F6F42"/>
-          </w:tcPr>
-          <w:p>
-            <w:r>
-              <w:rPr>
-                <w:b/>
-                <w:color w:val="FFFFFF"/>
-                <w:sz w:val="20"/>
-              </w:rPr>
-              <w:t>#</w:t>
-            </w:r>
-          </w:p>
-        </w:tc>
-        <w:tc>
-          <w:tcPr>
-            <w:tcW w:type="dxa" w:w="3249"/>
-            <w:shd w:val="clear" w:color="auto" w:fill="1F6F42"/>
-          </w:tcPr>
-          <w:p>
-            <w:r>
-              <w:rPr>
-                <w:b/>
-                <w:color w:val="FFFFFF"/>
-                <w:sz w:val="20"/>
-              </w:rPr>
-              <w:t>Tab</w:t>
-            </w:r>
-          </w:p>
-        </w:tc>
-        <w:tc>
-          <w:tcPr>
-            <w:tcW w:type="dxa" w:w="3249"/>
-            <w:shd w:val="clear" w:color="auto" w:fill="1F6F42"/>
-          </w:tcPr>
-          <w:p>
-            <w:r>
-              <w:rPr>
-                <w:b/>
-                <w:color w:val="FFFFFF"/>
-                <w:sz w:val="20"/>
-              </w:rPr>
-              <w:t>What it shows</w:t>
-            </w:r>
-          </w:p>
-        </w:tc>
-      </w:tr>
-      <w:tr>
-        <w:tc>
-          <w:tcPr>
-            <w:tcW w:type="dxa" w:w="3249"/>
-          </w:tcPr>
-          <w:p>
-            <w:r>
-              <w:rPr>
-                <w:sz w:val="20"/>
-              </w:rPr>
-              <w:t>Tab 1</w:t>
-            </w:r>
-          </w:p>
-        </w:tc>
-        <w:tc>
-          <w:tcPr>
-            <w:tcW w:type="dxa" w:w="3249"/>
-          </w:tcPr>
-          <w:p>
-            <w:r>
-              <w:rPr>
-                <w:b/>
-                <w:sz w:val="20"/>
-              </w:rPr>
-              <w:t>Overview</w:t>
-            </w:r>
-          </w:p>
-        </w:tc>
-        <w:tc>
-          <w:tcPr>
-            <w:tcW w:type="dxa" w:w="3249"/>
-          </w:tcPr>
-          <w:p>
-            <w:r>
-              <w:rPr>
-                <w:sz w:val="20"/>
-              </w:rPr>
-              <w:t>Score distribution and an at-a-glance average-score gauge.</w:t>
-            </w:r>
-          </w:p>
-        </w:tc>
-      </w:tr>
-      <w:tr>
-        <w:tc>
-          <w:tcPr>
-            <w:tcW w:type="dxa" w:w="3249"/>
-          </w:tcPr>
-          <w:p>
-            <w:r>
-              <w:rPr>
-                <w:sz w:val="20"/>
-              </w:rPr>
-              <w:t>Tab 2</w:t>
-            </w:r>
-          </w:p>
-        </w:tc>
-        <w:tc>
-          <w:tcPr>
-            <w:tcW w:type="dxa" w:w="3249"/>
-          </w:tcPr>
-          <w:p>
-            <w:r>
-              <w:rPr>
-                <w:b/>
-                <w:sz w:val="20"/>
-              </w:rPr>
-              <w:t>Agent Performance</w:t>
-            </w:r>
-          </w:p>
-        </w:tc>
-        <w:tc>
-          <w:tcPr>
-            <w:tcW w:type="dxa" w:w="3249"/>
-          </w:tcPr>
-          <w:p>
-            <w:r>
-              <w:rPr>
-                <w:sz w:val="20"/>
-              </w:rPr>
-              <w:t>Average score and call count for every agent audited.</w:t>
-            </w:r>
-          </w:p>
-        </w:tc>
-      </w:tr>
-      <w:tr>
-        <w:tc>
-          <w:tcPr>
-            <w:tcW w:type="dxa" w:w="3249"/>
-          </w:tcPr>
-          <w:p>
-            <w:r>
-              <w:rPr>
-                <w:sz w:val="20"/>
-              </w:rPr>
-              <w:t>Tab 3</w:t>
-            </w:r>
-          </w:p>
-        </w:tc>
-        <w:tc>
-          <w:tcPr>
-            <w:tcW w:type="dxa" w:w="3249"/>
-          </w:tcPr>
-          <w:p>
-            <w:r>
-              <w:rPr>
-                <w:b/>
-                <w:sz w:val="20"/>
-              </w:rPr>
-              <w:t>Timeline</w:t>
-            </w:r>
-          </w:p>
-        </w:tc>
-        <w:tc>
-          <w:tcPr>
-            <w:tcW w:type="dxa" w:w="3249"/>
-          </w:tcPr>
-          <w:p>
-            <w:r>
-              <w:rPr>
-                <w:sz w:val="20"/>
-              </w:rPr>
-              <w:t>Score and audit volume trended by call date.</w:t>
-            </w:r>
-          </w:p>
-        </w:tc>
-      </w:tr>
-      <w:tr>
-        <w:tc>
-          <w:tcPr>
-            <w:tcW w:type="dxa" w:w="3249"/>
-          </w:tcPr>
-          <w:p>
-            <w:r>
-              <w:rPr>
-                <w:sz w:val="20"/>
-              </w:rPr>
-              <w:t>Tab 4</w:t>
-            </w:r>
-          </w:p>
-        </w:tc>
-        <w:tc>
-          <w:tcPr>
-            <w:tcW w:type="dxa" w:w="3249"/>
-          </w:tcPr>
-          <w:p>
-            <w:r>
-              <w:rPr>
-                <w:b/>
-                <w:sz w:val="20"/>
-              </w:rPr>
-              <w:t>Comments</w:t>
-            </w:r>
-          </w:p>
-        </w:tc>
-        <w:tc>
-          <w:tcPr>
-            <w:tcW w:type="dxa" w:w="3249"/>
-          </w:tcPr>
-          <w:p>
-            <w:r>
-              <w:rPr>
-                <w:sz w:val="20"/>
-              </w:rPr>
-              <w:t>Every comment left during an audit, filterable by score.</w:t>
-            </w:r>
-          </w:p>
-        </w:tc>
-      </w:tr>
-      <w:tr>
-        <w:tc>
-          <w:tcPr>
-            <w:tcW w:type="dxa" w:w="3249"/>
-          </w:tcPr>
-          <w:p>
-            <w:r>
-              <w:rPr>
-                <w:sz w:val="20"/>
-              </w:rPr>
-              <w:t>Tab 5</w:t>
-            </w:r>
-          </w:p>
-        </w:tc>
-        <w:tc>
-          <w:tcPr>
-            <w:tcW w:type="dxa" w:w="3249"/>
-          </w:tcPr>
-          <w:p>
-            <w:r>
-              <w:rPr>
-                <w:b/>
-                <w:sz w:val="20"/>
-              </w:rPr>
-              <w:t>Raw Data</w:t>
-            </w:r>
-          </w:p>
-        </w:tc>
-        <w:tc>
-          <w:tcPr>
-            <w:tcW w:type="dxa" w:w="3249"/>
-          </w:tcPr>
-          <w:p>
-            <w:r>
-              <w:rPr>
-                <w:sz w:val="20"/>
-              </w:rPr>
-              <w:t>Full filtered dataset, plus Download Report as Excel -- a formatted, multi-sheet workbook.</w:t>
-            </w:r>
-          </w:p>
-        </w:tc>
-      </w:tr>
-      <w:tr>
-        <w:tc>
-          <w:tcPr>
-            <w:tcW w:type="dxa" w:w="3249"/>
-          </w:tcPr>
-          <w:p>
-            <w:r>
-              <w:rPr>
-                <w:sz w:val="20"/>
-              </w:rPr>
-              <w:t>Tab 6</w:t>
-            </w:r>
-          </w:p>
-        </w:tc>
-        <w:tc>
-          <w:tcPr>
-            <w:tcW w:type="dxa" w:w="3249"/>
-          </w:tcPr>
-          <w:p>
-            <w:r>
-              <w:rPr>
-                <w:b/>
-                <w:sz w:val="20"/>
-              </w:rPr>
-              <w:t>Unfinished Calls</w:t>
-            </w:r>
-          </w:p>
-        </w:tc>
-        <w:tc>
-          <w:tcPr>
-            <w:tcW w:type="dxa" w:w="3249"/>
-          </w:tcPr>
-          <w:p>
-            <w:r>
-              <w:rPr>
-                <w:sz w:val="20"/>
-              </w:rPr>
-              <w:t>Per-auditor outstanding count and percentage -- the supervisor's progress check.</w:t>
-            </w:r>
-          </w:p>
-        </w:tc>
-      </w:tr>
-    </w:tbl>
-    <w:p>
-      <w:pPr>
-        <w:spacing w:after="80"/>
-      </w:pPr>
-    </w:p>
-    <w:p>
-      <w:r>
-        <w:br w:type="page"/>
+        <w:t>Assignments: Call_Assignments/</w:t>
       </w:r>
     </w:p>
     <w:p>
       <w:pPr>
-        <w:pStyle w:val="Heading1"/>
+        <w:pStyle w:val="ListBullet"/>
       </w:pPr>
       <w:r>
-        <w:rPr>
-          <w:color w:val="1B2420"/>
-        </w:rPr>
-        <w:t>Troubleshooting</w:t>
+        <w:t>Unfinished call snapshots: unfinished calls/</w:t>
+      </w:r>
+    </w:p>
+    <w:p>
+      <w:r>
+        <w:t>Do not rename these folders unless your administrator updates app configuration accordingly.</w:t>
       </w:r>
     </w:p>
     <w:p>
       <w:pPr>
-        <w:spacing w:after="200"/>
+        <w:pStyle w:val="Heading2"/>
       </w:pPr>
       <w:r>
-        <w:rPr>
-          <w:b/>
-          <w:color w:val="51594F"/>
-          <w:sz w:val="16"/>
-        </w:rPr>
-        <w:t xml:space="preserve">  EVERYONE  </w:t>
+        <w:t>8. Logout</w:t>
+      </w:r>
+    </w:p>
+    <w:p>
+      <w:r>
+        <w:t>Always click Logout from the sidebar before closing the browser.</w:t>
+      </w:r>
+    </w:p>
+    <w:p>
+      <w:r>
+        <w:t>This helps prevent session confusion on shared machines.</w:t>
       </w:r>
     </w:p>
     <w:p>
       <w:pPr>
-        <w:spacing w:before="200" w:after="40"/>
+        <w:pStyle w:val="Heading2"/>
       </w:pPr>
       <w:r>
-        <w:rPr>
-          <w:b/>
-          <w:color w:val="1F6F42"/>
-          <w:sz w:val="22"/>
-        </w:rPr>
-        <w:t>Q:  I'm an auditor and my assigned-calls list is empty</w:t>
+        <w:t>9. Common Issues</w:t>
       </w:r>
     </w:p>
     <w:p>
       <w:pPr>
-        <w:spacing w:after="120"/>
-        <w:ind w:left="360"/>
+        <w:pStyle w:val="Heading3"/>
       </w:pPr>
       <w:r>
-        <w:rPr>
-          <w:sz w:val="21"/>
-        </w:rPr>
-        <w:t>Either nothing has been assigned to you yet, or you've finished everything currently assigned. Check with your supervisor -- a new round of assignment will repopulate your list.</w:t>
+        <w:t>9.1 I cannot see calls in Tool</w:t>
       </w:r>
     </w:p>
     <w:p>
       <w:pPr>
-        <w:spacing w:before="200" w:after="40"/>
+        <w:pStyle w:val="ListBullet"/>
       </w:pPr>
       <w:r>
-        <w:rPr>
-          <w:b/>
-          <w:color w:val="1F6F42"/>
-          <w:sz w:val="22"/>
-        </w:rPr>
-        <w:t>Q:  A call I audited is still showing as unfinished</w:t>
+        <w:t>Confirm you are logged into the correct account.</w:t>
       </w:r>
     </w:p>
     <w:p>
       <w:pPr>
-        <w:spacing w:after="120"/>
-        <w:ind w:left="360"/>
+        <w:pStyle w:val="ListBullet"/>
       </w:pPr>
       <w:r>
-        <w:rPr>
-          <w:sz w:val="21"/>
-        </w:rPr>
-        <w:t>Confirm you clicked "Save Audit Log" after scoring it, and that the save succeeded (you should see a green confirmation message). The list only updates on the next load of your assigned calls.</w:t>
+        <w:t>For auditors, confirm calls are assigned to your email.</w:t>
       </w:r>
     </w:p>
     <w:p>
       <w:pPr>
-        <w:spacing w:before="200" w:after="40"/>
+        <w:pStyle w:val="ListBullet"/>
       </w:pPr>
       <w:r>
-        <w:rPr>
-          <w:b/>
-          <w:color w:val="1F6F42"/>
-          <w:sz w:val="22"/>
-        </w:rPr>
-        <w:t>Q:  The supervisor panel says "No available (unassigned) calls found"</w:t>
+        <w:t>Ask supervisor to verify assignment records.</w:t>
       </w:r>
     </w:p>
     <w:p>
       <w:pPr>
-        <w:spacing w:after="120"/>
-        <w:ind w:left="360"/>
+        <w:pStyle w:val="Heading3"/>
       </w:pPr>
       <w:r>
-        <w:rPr>
-          <w:sz w:val="21"/>
-        </w:rPr>
-        <w:t>The call source folder is empty, or every recording in it has already been assigned. Point "Call Source" at a folder with fresh recordings, or check "Allow reassigning" if you intend to re-audit already-assigned calls.</w:t>
+        <w:t>9.2 Save Audit Log does not work</w:t>
       </w:r>
     </w:p>
     <w:p>
       <w:pPr>
-        <w:spacing w:before="200" w:after="40"/>
+        <w:pStyle w:val="ListBullet"/>
       </w:pPr>
       <w:r>
-        <w:rPr>
-          <w:b/>
-          <w:color w:val="1F6F42"/>
-          <w:sz w:val="22"/>
-        </w:rPr>
-        <w:t>Q:  Dashboard says "No audit log files found"</w:t>
+        <w:t>Confirm all required fields are completed.</w:t>
       </w:r>
     </w:p>
     <w:p>
       <w:pPr>
-        <w:spacing w:after="120"/>
-        <w:ind w:left="360"/>
+        <w:pStyle w:val="ListBullet"/>
       </w:pPr>
       <w:r>
-        <w:rPr>
-          <w:sz w:val="21"/>
-        </w:rPr>
-        <w:t>No one has saved an audit yet, so there's nothing to visualize. Run at least one audit in Tool mode first.</w:t>
+        <w:t>Check for invalid date or score entries.</w:t>
+      </w:r>
+    </w:p>
+    <w:p>
+      <w:pPr>
+        <w:pStyle w:val="ListBullet"/>
+      </w:pPr>
+      <w:r>
+        <w:t>Retry once after refresh.</w:t>
+      </w:r>
+    </w:p>
+    <w:p>
+      <w:pPr>
+        <w:pStyle w:val="Heading3"/>
+      </w:pPr>
+      <w:r>
+        <w:t>9.3 Dashboard looks empty</w:t>
+      </w:r>
+    </w:p>
+    <w:p>
+      <w:pPr>
+        <w:pStyle w:val="ListBullet"/>
+      </w:pPr>
+      <w:r>
+        <w:t>Ensure audit logs exist in Audit_log_calls/.</w:t>
+      </w:r>
+    </w:p>
+    <w:p>
+      <w:pPr>
+        <w:pStyle w:val="ListBullet"/>
+      </w:pPr>
+      <w:r>
+        <w:t>Clear filters and check again.</w:t>
+      </w:r>
+    </w:p>
+    <w:p>
+      <w:pPr>
+        <w:pStyle w:val="ListBullet"/>
+      </w:pPr>
+      <w:r>
+        <w:t>Confirm the selected date range includes available records.</w:t>
+      </w:r>
+    </w:p>
+    <w:p>
+      <w:pPr>
+        <w:pStyle w:val="Heading2"/>
+      </w:pPr>
+      <w:r>
+        <w:t>10. Best Practices</w:t>
+      </w:r>
+    </w:p>
+    <w:p>
+      <w:pPr>
+        <w:pStyle w:val="ListBullet"/>
+      </w:pPr>
+      <w:r>
+        <w:t>Complete audits in one session when possible.</w:t>
+      </w:r>
+    </w:p>
+    <w:p>
+      <w:pPr>
+        <w:pStyle w:val="ListBullet"/>
+      </w:pPr>
+      <w:r>
+        <w:t>Use consistent scoring standards across auditors.</w:t>
+      </w:r>
+    </w:p>
+    <w:p>
+      <w:pPr>
+        <w:pStyle w:val="ListBullet"/>
+      </w:pPr>
+      <w:r>
+        <w:t>Keep comments specific and actionable.</w:t>
+      </w:r>
+    </w:p>
+    <w:p>
+      <w:pPr>
+        <w:pStyle w:val="ListBullet"/>
+      </w:pPr>
+      <w:r>
+        <w:t>Supervisors should review unfinished calls regularly.</w:t>
+      </w:r>
+    </w:p>
+    <w:p>
+      <w:pPr>
+        <w:pStyle w:val="Heading2"/>
+      </w:pPr>
+      <w:r>
+        <w:t>11. Support</w:t>
       </w:r>
     </w:p>
     <w:p>
       <w:r>
-        <w:br w:type="page"/>
+        <w:t>If you need help:</w:t>
       </w:r>
     </w:p>
     <w:p>
-      <w:pPr>
-        <w:pStyle w:val="Heading1"/>
-      </w:pPr>
       <w:r>
-        <w:rPr>
-          <w:color w:val="1B2420"/>
-        </w:rPr>
-        <w:t>Quick Reference</w:t>
+        <w:t>1. Capture a screenshot of the issue.</w:t>
       </w:r>
     </w:p>
     <w:p>
-      <w:pPr>
-        <w:spacing w:after="200"/>
-      </w:pPr>
       <w:r>
-        <w:rPr>
-          <w:b/>
-          <w:color w:val="51594F"/>
-          <w:sz w:val="16"/>
-        </w:rPr>
-        <w:t xml:space="preserve">  EVERYONE  </w:t>
+        <w:t>2. Note the time and your username.</w:t>
       </w:r>
     </w:p>
-    <w:tbl>
-      <w:tblPr>
-        <w:tblStyle w:val="TableGrid"/>
-        <w:tblW w:type="auto" w:w="0"/>
-        <w:tblLook w:firstColumn="1" w:firstRow="1" w:lastColumn="0" w:lastRow="0" w:noHBand="0" w:noVBand="1" w:val="04A0"/>
-      </w:tblPr>
-      <w:tblGrid>
-        <w:gridCol w:w="3249"/>
-        <w:gridCol w:w="3249"/>
-        <w:gridCol w:w="3249"/>
-      </w:tblGrid>
-      <w:tr>
-        <w:tc>
-          <w:tcPr>
-            <w:tcW w:type="dxa" w:w="3249"/>
-            <w:shd w:val="clear" w:color="auto" w:fill="1F6F42"/>
-          </w:tcPr>
-          <w:p>
-            <w:r>
-              <w:rPr>
-                <w:b/>
-                <w:color w:val="FFFFFF"/>
-                <w:sz w:val="20"/>
-              </w:rPr>
-              <w:t>I want to...</w:t>
-            </w:r>
-          </w:p>
-        </w:tc>
-        <w:tc>
-          <w:tcPr>
-            <w:tcW w:type="dxa" w:w="3249"/>
-            <w:shd w:val="clear" w:color="auto" w:fill="1F6F42"/>
-          </w:tcPr>
-          <w:p>
-            <w:r>
-              <w:rPr>
-                <w:b/>
-                <w:color w:val="FFFFFF"/>
-                <w:sz w:val="20"/>
-              </w:rPr>
-              <w:t>Go to</w:t>
-            </w:r>
-          </w:p>
-        </w:tc>
-        <w:tc>
-          <w:tcPr>
-            <w:tcW w:type="dxa" w:w="3249"/>
-            <w:shd w:val="clear" w:color="auto" w:fill="1F6F42"/>
-          </w:tcPr>
-          <w:p>
-            <w:r>
-              <w:rPr>
-                <w:b/>
-                <w:color w:val="FFFFFF"/>
-                <w:sz w:val="20"/>
-              </w:rPr>
-              <w:t>Click</w:t>
-            </w:r>
-          </w:p>
-        </w:tc>
-      </w:tr>
-      <w:tr>
-        <w:tc>
-          <w:tcPr>
-            <w:tcW w:type="dxa" w:w="3249"/>
-          </w:tcPr>
-          <w:p>
-            <w:r>
-              <w:rPr>
-                <w:sz w:val="20"/>
-              </w:rPr>
-              <w:t>Hand calls to my team</w:t>
-            </w:r>
-          </w:p>
-        </w:tc>
-        <w:tc>
-          <w:tcPr>
-            <w:tcW w:type="dxa" w:w="3249"/>
-          </w:tcPr>
-          <w:p>
-            <w:r>
-              <w:rPr>
-                <w:sz w:val="20"/>
-              </w:rPr>
-              <w:t>Tool mode</w:t>
-            </w:r>
-          </w:p>
-        </w:tc>
-        <w:tc>
-          <w:tcPr>
-            <w:tcW w:type="dxa" w:w="3249"/>
-          </w:tcPr>
-          <w:p>
-            <w:r>
-              <w:rPr>
-                <w:rFonts w:ascii="Consolas" w:hAnsi="Consolas"/>
-                <w:sz w:val="20"/>
-              </w:rPr>
-              <w:t>Assign Calls</w:t>
-            </w:r>
-          </w:p>
-        </w:tc>
-      </w:tr>
-      <w:tr>
-        <w:tc>
-          <w:tcPr>
-            <w:tcW w:type="dxa" w:w="3249"/>
-          </w:tcPr>
-          <w:p>
-            <w:r>
-              <w:rPr>
-                <w:sz w:val="20"/>
-              </w:rPr>
-              <w:t>See what I still owe</w:t>
-            </w:r>
-          </w:p>
-        </w:tc>
-        <w:tc>
-          <w:tcPr>
-            <w:tcW w:type="dxa" w:w="3249"/>
-          </w:tcPr>
-          <w:p>
-            <w:r>
-              <w:rPr>
-                <w:sz w:val="20"/>
-              </w:rPr>
-              <w:t>Tool mode</w:t>
-            </w:r>
-          </w:p>
-        </w:tc>
-        <w:tc>
-          <w:tcPr>
-            <w:tcW w:type="dxa" w:w="3249"/>
-          </w:tcPr>
-          <w:p>
-            <w:r>
-              <w:rPr>
-                <w:rFonts w:ascii="Consolas" w:hAnsi="Consolas"/>
-                <w:sz w:val="20"/>
-              </w:rPr>
-              <w:t>Load My Assigned Calls</w:t>
-            </w:r>
-          </w:p>
-        </w:tc>
-      </w:tr>
-      <w:tr>
-        <w:tc>
-          <w:tcPr>
-            <w:tcW w:type="dxa" w:w="3249"/>
-          </w:tcPr>
-          <w:p>
-            <w:r>
-              <w:rPr>
-                <w:sz w:val="20"/>
-              </w:rPr>
-              <w:t>Score a call</w:t>
-            </w:r>
-          </w:p>
-        </w:tc>
-        <w:tc>
-          <w:tcPr>
-            <w:tcW w:type="dxa" w:w="3249"/>
-          </w:tcPr>
-          <w:p>
-            <w:r>
-              <w:rPr>
-                <w:sz w:val="20"/>
-              </w:rPr>
-              <w:t>Tool mode -&gt; audit form</w:t>
-            </w:r>
-          </w:p>
-        </w:tc>
-        <w:tc>
-          <w:tcPr>
-            <w:tcW w:type="dxa" w:w="3249"/>
-          </w:tcPr>
-          <w:p>
-            <w:r>
-              <w:rPr>
-                <w:rFonts w:ascii="Consolas" w:hAnsi="Consolas"/>
-                <w:sz w:val="20"/>
-              </w:rPr>
-              <w:t>Save Audit Log</w:t>
-            </w:r>
-          </w:p>
-        </w:tc>
-      </w:tr>
-      <w:tr>
-        <w:tc>
-          <w:tcPr>
-            <w:tcW w:type="dxa" w:w="3249"/>
-          </w:tcPr>
-          <w:p>
-            <w:r>
-              <w:rPr>
-                <w:sz w:val="20"/>
-              </w:rPr>
-              <w:t>Check team-wide progress</w:t>
-            </w:r>
-          </w:p>
-        </w:tc>
-        <w:tc>
-          <w:tcPr>
-            <w:tcW w:type="dxa" w:w="3249"/>
-          </w:tcPr>
-          <w:p>
-            <w:r>
-              <w:rPr>
-                <w:sz w:val="20"/>
-              </w:rPr>
-              <w:t>Dashboard -&gt; Unfinished Calls</w:t>
-            </w:r>
-          </w:p>
-        </w:tc>
-        <w:tc>
-          <w:tcPr>
-            <w:tcW w:type="dxa" w:w="3249"/>
-          </w:tcPr>
-          <w:p>
-            <w:r>
-              <w:rPr>
-                <w:rFonts w:ascii="Consolas" w:hAnsi="Consolas"/>
-                <w:sz w:val="20"/>
-              </w:rPr>
-              <w:t>--</w:t>
-            </w:r>
-          </w:p>
-        </w:tc>
-      </w:tr>
-      <w:tr>
-        <w:tc>
-          <w:tcPr>
-            <w:tcW w:type="dxa" w:w="3249"/>
-          </w:tcPr>
-          <w:p>
-            <w:r>
-              <w:rPr>
-                <w:sz w:val="20"/>
-              </w:rPr>
-              <w:t>Export a shareable report</w:t>
-            </w:r>
-          </w:p>
-        </w:tc>
-        <w:tc>
-          <w:tcPr>
-            <w:tcW w:type="dxa" w:w="3249"/>
-          </w:tcPr>
-          <w:p>
-            <w:r>
-              <w:rPr>
-                <w:sz w:val="20"/>
-              </w:rPr>
-              <w:t>Dashboard -&gt; Raw Data</w:t>
-            </w:r>
-          </w:p>
-        </w:tc>
-        <w:tc>
-          <w:tcPr>
-            <w:tcW w:type="dxa" w:w="3249"/>
-          </w:tcPr>
-          <w:p>
-            <w:r>
-              <w:rPr>
-                <w:rFonts w:ascii="Consolas" w:hAnsi="Consolas"/>
-                <w:sz w:val="20"/>
-              </w:rPr>
-              <w:t>Download Report as Excel</w:t>
-            </w:r>
-          </w:p>
-        </w:tc>
-      </w:tr>
-    </w:tbl>
     <w:p>
-      <w:pPr>
-        <w:spacing w:before="360"/>
-      </w:pPr>
       <w:r>
-        <w:rPr>
-          <w:i/>
-          <w:color w:val="51594F"/>
-          <w:sz w:val="17"/>
-        </w:rPr>
-        <w:t>QA Audit Platform User Manual -- companion to the technical documentation in documentation/QA_Call_Audit_Tool_Documentation.md.</w:t>
+        <w:t>3. Share the details with your supervisor or platform admin.</w:t>
+      </w:r>
+    </w:p>
+    <w:p/>
+    <w:p>
+      <w:r>
+        <w:t>Version: 1.0</w:t>
+      </w:r>
+    </w:p>
+    <w:p>
+      <w:r>
+        <w:t>Last Updated: 2026-08-03</w:t>
       </w:r>
     </w:p>
     <w:sectPr>
       <w:pgSz w:w="12240" w:h="15840"/>
-      <w:pgMar w:top="1020" w:right="1247" w:bottom="1020" w:left="1247" w:header="720" w:footer="720" w:gutter="0"/>
+      <w:pgMar w:top="1440" w:right="1800" w:bottom="1440" w:left="1800" w:header="720" w:footer="720" w:gutter="0"/>
       <w:cols w:space="720"/>
       <w:docGrid w:linePitch="360"/>
     </w:sectPr>
@@ -2256,7 +1061,6 @@
     <w:rsid w:val="00FC693F"/>
     <w:rPr>
       <w:rFonts w:ascii="Calibri" w:hAnsi="Calibri"/>
-      <w:color w:val="1B2420"/>
       <w:sz w:val="22"/>
     </w:rPr>
   </w:style>

</xml_diff>